<commit_message>
MATH1201 Unit 8: Task 3 nonlinear system (verified), GeoGebra guide, notes
Co-Authored-By: Claude Opus 5.5 <noreply@anthropic.com>
</commit_message>
<xml_diff>
--- a/MATH1201_College_Algebra/Unit8_Systems_of_Equations/Assignment/Unit8_Assignment_Activity.docx
+++ b/MATH1201_College_Algebra/Unit8_Systems_of_Equations/Assignment/Unit8_Assignment_Activity.docx
@@ -1839,8 +1839,976 @@
           <w:i w:val="0"/>
           <w:sz w:val="24"/>
         </w:rPr>
-        <w:t>[TASK 3 PENDING: waiting for the equations]</w:t>
+        <w:t>Solve and verify the system:</w:t>
       </w:r>
+    </w:p>
+    <w:p>
+      <w:pPr>
+        <w:spacing w:line="240" w:lineRule="auto" w:after="0"/>
+        <w:ind w:left="432"/>
+      </w:pPr>
+      <w:r>
+        <w:rPr>
+          <w:rFonts w:ascii="Courier New" w:hAnsi="Courier New"/>
+          <w:sz w:val="19"/>
+        </w:rPr>
+        <w:t>x + y = 4                (1)   a straight line</w:t>
+      </w:r>
+    </w:p>
+    <w:p>
+      <w:pPr>
+        <w:spacing w:line="240" w:lineRule="auto" w:after="0"/>
+        <w:ind w:left="432"/>
+      </w:pPr>
+      <w:r>
+        <w:rPr>
+          <w:rFonts w:ascii="Courier New" w:hAnsi="Courier New"/>
+          <w:sz w:val="19"/>
+        </w:rPr>
+        <w:t>x² - 2xy - 3 = 0         (2)   a curve (a hyperbola)</w:t>
+      </w:r>
+    </w:p>
+    <w:p>
+      <w:pPr>
+        <w:spacing w:after="0"/>
+      </w:pPr>
+    </w:p>
+    <w:p>
+      <w:pPr>
+        <w:pStyle w:val="Heading2"/>
+        <w:jc w:val="left"/>
+      </w:pPr>
+      <w:r>
+        <w:rPr>
+          <w:rFonts w:ascii="Times New Roman" w:hAnsi="Times New Roman"/>
+          <w:b/>
+          <w:color w:val="000000"/>
+          <w:sz w:val="24"/>
+        </w:rPr>
+        <w:t>Algebraic Solution (Substitution)</w:t>
+      </w:r>
+    </w:p>
+    <w:p>
+      <w:pPr>
+        <w:spacing w:line="360" w:lineRule="auto" w:after="200"/>
+      </w:pPr>
+      <w:r>
+        <w:rPr>
+          <w:rFonts w:ascii="Times New Roman" w:hAnsi="Times New Roman"/>
+          <w:b w:val="0"/>
+          <w:i w:val="0"/>
+          <w:sz w:val="24"/>
+        </w:rPr>
+        <w:t>For a system with one linear equation, the substitution method works best: solve the linear equation for one variable, substitute it into the nonlinear equation, solve, and check both equations (Abramson, 2021, Section 11.3; Mathispower4u, 2012).</w:t>
+      </w:r>
+    </w:p>
+    <w:p>
+      <w:pPr>
+        <w:spacing w:line="360" w:lineRule="auto" w:after="200"/>
+      </w:pPr>
+      <w:r>
+        <w:rPr>
+          <w:rFonts w:ascii="Times New Roman" w:hAnsi="Times New Roman"/>
+          <w:b/>
+          <w:i w:val="0"/>
+          <w:sz w:val="24"/>
+        </w:rPr>
+        <w:t>Step 1. Solve the line for y.</w:t>
+      </w:r>
+    </w:p>
+    <w:p>
+      <w:pPr>
+        <w:spacing w:line="240" w:lineRule="auto" w:after="0"/>
+        <w:ind w:left="432"/>
+      </w:pPr>
+      <w:r>
+        <w:rPr>
+          <w:rFonts w:ascii="Courier New" w:hAnsi="Courier New"/>
+          <w:sz w:val="19"/>
+        </w:rPr>
+        <w:t>x + y = 4   -&gt;   y = 4 - x</w:t>
+      </w:r>
+    </w:p>
+    <w:p>
+      <w:pPr>
+        <w:spacing w:after="0"/>
+      </w:pPr>
+    </w:p>
+    <w:p>
+      <w:pPr>
+        <w:spacing w:line="360" w:lineRule="auto" w:after="200"/>
+      </w:pPr>
+      <w:r>
+        <w:rPr>
+          <w:rFonts w:ascii="Times New Roman" w:hAnsi="Times New Roman"/>
+          <w:b/>
+          <w:i w:val="0"/>
+          <w:sz w:val="24"/>
+        </w:rPr>
+        <w:t>Step 2. Substitute into equation (2).</w:t>
+      </w:r>
+    </w:p>
+    <w:p>
+      <w:pPr>
+        <w:spacing w:line="240" w:lineRule="auto" w:after="0"/>
+        <w:ind w:left="432"/>
+      </w:pPr>
+      <w:r>
+        <w:rPr>
+          <w:rFonts w:ascii="Courier New" w:hAnsi="Courier New"/>
+          <w:sz w:val="19"/>
+        </w:rPr>
+        <w:t>x² - 2x(4 - x) - 3 = 0</w:t>
+      </w:r>
+    </w:p>
+    <w:p>
+      <w:pPr>
+        <w:spacing w:line="240" w:lineRule="auto" w:after="0"/>
+        <w:ind w:left="432"/>
+      </w:pPr>
+      <w:r>
+        <w:rPr>
+          <w:rFonts w:ascii="Courier New" w:hAnsi="Courier New"/>
+          <w:sz w:val="19"/>
+        </w:rPr>
+        <w:t>x² - 8x + 2x² - 3 = 0</w:t>
+      </w:r>
+    </w:p>
+    <w:p>
+      <w:pPr>
+        <w:spacing w:line="240" w:lineRule="auto" w:after="0"/>
+        <w:ind w:left="432"/>
+      </w:pPr>
+      <w:r>
+        <w:rPr>
+          <w:rFonts w:ascii="Courier New" w:hAnsi="Courier New"/>
+          <w:sz w:val="19"/>
+        </w:rPr>
+        <w:t>3x² - 8x - 3 = 0</w:t>
+      </w:r>
+    </w:p>
+    <w:p>
+      <w:pPr>
+        <w:spacing w:after="0"/>
+      </w:pPr>
+    </w:p>
+    <w:p>
+      <w:pPr>
+        <w:spacing w:line="360" w:lineRule="auto" w:after="200"/>
+      </w:pPr>
+      <w:r>
+        <w:rPr>
+          <w:rFonts w:ascii="Times New Roman" w:hAnsi="Times New Roman"/>
+          <w:b/>
+          <w:i w:val="0"/>
+          <w:sz w:val="24"/>
+        </w:rPr>
+        <w:t>Step 3. Solve the quadratic by factoring.</w:t>
+      </w:r>
+      <w:r>
+        <w:rPr>
+          <w:rFonts w:ascii="Times New Roman" w:hAnsi="Times New Roman"/>
+          <w:b w:val="0"/>
+          <w:i w:val="0"/>
+          <w:sz w:val="24"/>
+        </w:rPr>
+        <w:t xml:space="preserve"> Two numbers that multiply to 3 × (-3) = -9 and add to -8 are -9 and 1:</w:t>
+      </w:r>
+    </w:p>
+    <w:p>
+      <w:pPr>
+        <w:spacing w:line="240" w:lineRule="auto" w:after="0"/>
+        <w:ind w:left="432"/>
+      </w:pPr>
+      <w:r>
+        <w:rPr>
+          <w:rFonts w:ascii="Courier New" w:hAnsi="Courier New"/>
+          <w:sz w:val="19"/>
+        </w:rPr>
+        <w:t>3x² - 9x + x - 3 = 0</w:t>
+      </w:r>
+    </w:p>
+    <w:p>
+      <w:pPr>
+        <w:spacing w:line="240" w:lineRule="auto" w:after="0"/>
+        <w:ind w:left="432"/>
+      </w:pPr>
+      <w:r>
+        <w:rPr>
+          <w:rFonts w:ascii="Courier New" w:hAnsi="Courier New"/>
+          <w:sz w:val="19"/>
+        </w:rPr>
+        <w:t>3x(x - 3) + 1(x - 3) = 0</w:t>
+      </w:r>
+    </w:p>
+    <w:p>
+      <w:pPr>
+        <w:spacing w:line="240" w:lineRule="auto" w:after="0"/>
+        <w:ind w:left="432"/>
+      </w:pPr>
+      <w:r>
+        <w:rPr>
+          <w:rFonts w:ascii="Courier New" w:hAnsi="Courier New"/>
+          <w:sz w:val="19"/>
+        </w:rPr>
+        <w:t>(3x + 1)(x - 3) = 0</w:t>
+      </w:r>
+    </w:p>
+    <w:p>
+      <w:pPr>
+        <w:spacing w:line="240" w:lineRule="auto" w:after="0"/>
+        <w:ind w:left="432"/>
+      </w:pPr>
+      <w:r>
+        <w:rPr>
+          <w:rFonts w:ascii="Courier New" w:hAnsi="Courier New"/>
+          <w:sz w:val="19"/>
+        </w:rPr>
+        <w:t>x = 3   or   x = -1/3</w:t>
+      </w:r>
+    </w:p>
+    <w:p>
+      <w:pPr>
+        <w:spacing w:after="0"/>
+      </w:pPr>
+    </w:p>
+    <w:p>
+      <w:pPr>
+        <w:spacing w:line="360" w:lineRule="auto" w:after="200"/>
+      </w:pPr>
+      <w:r>
+        <w:rPr>
+          <w:rFonts w:ascii="Times New Roman" w:hAnsi="Times New Roman"/>
+          <w:b w:val="0"/>
+          <w:i w:val="0"/>
+          <w:sz w:val="24"/>
+        </w:rPr>
+        <w:t>(The quadratic formula agrees: x = [8 ± √(64 + 36)] / 6 = (8 ± 10) / 6, so x = 3 or x = -1/3.)</w:t>
+      </w:r>
+    </w:p>
+    <w:p>
+      <w:pPr>
+        <w:spacing w:line="360" w:lineRule="auto" w:after="200"/>
+      </w:pPr>
+      <w:r>
+        <w:rPr>
+          <w:rFonts w:ascii="Times New Roman" w:hAnsi="Times New Roman"/>
+          <w:b/>
+          <w:i w:val="0"/>
+          <w:sz w:val="24"/>
+        </w:rPr>
+        <w:t>Step 4. Find y for each x using y = 4 - x.</w:t>
+      </w:r>
+    </w:p>
+    <w:p>
+      <w:pPr>
+        <w:spacing w:line="240" w:lineRule="auto" w:after="0"/>
+        <w:ind w:left="432"/>
+      </w:pPr>
+      <w:r>
+        <w:rPr>
+          <w:rFonts w:ascii="Courier New" w:hAnsi="Courier New"/>
+          <w:sz w:val="19"/>
+        </w:rPr>
+        <w:t>x = 3:      y = 4 - 3     = 1        -&gt;  point (3, 1)</w:t>
+      </w:r>
+    </w:p>
+    <w:p>
+      <w:pPr>
+        <w:spacing w:line="240" w:lineRule="auto" w:after="0"/>
+        <w:ind w:left="432"/>
+      </w:pPr>
+      <w:r>
+        <w:rPr>
+          <w:rFonts w:ascii="Courier New" w:hAnsi="Courier New"/>
+          <w:sz w:val="19"/>
+        </w:rPr>
+        <w:t>x = -1/3:   y = 4 + 1/3   = 13/3     -&gt;  point (-1/3, 13/3) ≈ (-0.333, 4.333)</w:t>
+      </w:r>
+    </w:p>
+    <w:p>
+      <w:pPr>
+        <w:spacing w:after="0"/>
+      </w:pPr>
+    </w:p>
+    <w:p>
+      <w:pPr>
+        <w:spacing w:line="360" w:lineRule="auto" w:after="200"/>
+      </w:pPr>
+      <w:r>
+        <w:rPr>
+          <w:rFonts w:ascii="Times New Roman" w:hAnsi="Times New Roman"/>
+          <w:b/>
+          <w:i w:val="0"/>
+          <w:sz w:val="24"/>
+        </w:rPr>
+        <w:t>Solution: (3, 1) and (-1/3, 13/3).</w:t>
+      </w:r>
+    </w:p>
+    <w:p>
+      <w:pPr>
+        <w:pStyle w:val="Heading2"/>
+        <w:jc w:val="left"/>
+      </w:pPr>
+      <w:r>
+        <w:rPr>
+          <w:rFonts w:ascii="Times New Roman" w:hAnsi="Times New Roman"/>
+          <w:b/>
+          <w:color w:val="000000"/>
+          <w:sz w:val="24"/>
+        </w:rPr>
+        <w:t>Algebraic Verification</w:t>
+      </w:r>
+    </w:p>
+    <w:p>
+      <w:pPr>
+        <w:spacing w:line="360" w:lineRule="auto" w:after="0"/>
+      </w:pPr>
+      <w:r>
+        <w:rPr>
+          <w:rFonts w:ascii="Times New Roman" w:hAnsi="Times New Roman"/>
+          <w:b/>
+          <w:i w:val="0"/>
+          <w:sz w:val="24"/>
+        </w:rPr>
+        <w:t>Table 2</w:t>
+      </w:r>
+    </w:p>
+    <w:p>
+      <w:pPr>
+        <w:spacing w:line="360" w:lineRule="auto" w:after="0"/>
+      </w:pPr>
+      <w:r>
+        <w:rPr>
+          <w:rFonts w:ascii="Times New Roman" w:hAnsi="Times New Roman"/>
+          <w:b w:val="0"/>
+          <w:i/>
+          <w:sz w:val="24"/>
+        </w:rPr>
+        <w:t>Checking Both Points in Both Equations</w:t>
+      </w:r>
+    </w:p>
+    <w:tbl>
+      <w:tblPr>
+        <w:tblStyle w:val="TableGrid"/>
+        <w:tblW w:type="auto" w:w="0"/>
+        <w:tblLook w:firstColumn="1" w:firstRow="1" w:lastColumn="0" w:lastRow="0" w:noHBand="0" w:noVBand="1" w:val="04A0"/>
+      </w:tblPr>
+      <w:tblGrid>
+        <w:gridCol w:w="3120"/>
+        <w:gridCol w:w="3120"/>
+        <w:gridCol w:w="3120"/>
+      </w:tblGrid>
+      <w:tr>
+        <w:tc>
+          <w:tcPr>
+            <w:tcW w:type="dxa" w:w="3120"/>
+          </w:tcPr>
+          <w:p>
+            <w:pPr>
+              <w:spacing w:line="240" w:lineRule="auto"/>
+            </w:pPr>
+            <w:r>
+              <w:rPr>
+                <w:rFonts w:ascii="Times New Roman" w:hAnsi="Times New Roman"/>
+                <w:b/>
+                <w:sz w:val="21"/>
+              </w:rPr>
+              <w:t>Point</w:t>
+            </w:r>
+          </w:p>
+        </w:tc>
+        <w:tc>
+          <w:tcPr>
+            <w:tcW w:type="dxa" w:w="3120"/>
+          </w:tcPr>
+          <w:p>
+            <w:pPr>
+              <w:spacing w:line="240" w:lineRule="auto"/>
+            </w:pPr>
+            <w:r>
+              <w:rPr>
+                <w:rFonts w:ascii="Times New Roman" w:hAnsi="Times New Roman"/>
+                <w:b/>
+                <w:sz w:val="21"/>
+              </w:rPr>
+              <w:t>Equation (1): x + y</w:t>
+            </w:r>
+          </w:p>
+        </w:tc>
+        <w:tc>
+          <w:tcPr>
+            <w:tcW w:type="dxa" w:w="3120"/>
+          </w:tcPr>
+          <w:p>
+            <w:pPr>
+              <w:spacing w:line="240" w:lineRule="auto"/>
+            </w:pPr>
+            <w:r>
+              <w:rPr>
+                <w:rFonts w:ascii="Times New Roman" w:hAnsi="Times New Roman"/>
+                <w:b/>
+                <w:sz w:val="21"/>
+              </w:rPr>
+              <w:t>Equation (2): x² - 2xy - 3</w:t>
+            </w:r>
+          </w:p>
+        </w:tc>
+      </w:tr>
+      <w:tr>
+        <w:tc>
+          <w:tcPr>
+            <w:tcW w:type="dxa" w:w="3120"/>
+          </w:tcPr>
+          <w:p>
+            <w:pPr>
+              <w:spacing w:line="240" w:lineRule="auto"/>
+            </w:pPr>
+            <w:r>
+              <w:rPr>
+                <w:rFonts w:ascii="Times New Roman" w:hAnsi="Times New Roman"/>
+                <w:b w:val="0"/>
+                <w:sz w:val="21"/>
+              </w:rPr>
+              <w:t>(3, 1)</w:t>
+            </w:r>
+          </w:p>
+        </w:tc>
+        <w:tc>
+          <w:tcPr>
+            <w:tcW w:type="dxa" w:w="3120"/>
+          </w:tcPr>
+          <w:p>
+            <w:pPr>
+              <w:spacing w:line="240" w:lineRule="auto"/>
+            </w:pPr>
+            <w:r>
+              <w:rPr>
+                <w:rFonts w:ascii="Times New Roman" w:hAnsi="Times New Roman"/>
+                <w:b w:val="0"/>
+                <w:sz w:val="21"/>
+              </w:rPr>
+              <w:t>3 + 1 = 4 ✓</w:t>
+            </w:r>
+          </w:p>
+        </w:tc>
+        <w:tc>
+          <w:tcPr>
+            <w:tcW w:type="dxa" w:w="3120"/>
+          </w:tcPr>
+          <w:p>
+            <w:pPr>
+              <w:spacing w:line="240" w:lineRule="auto"/>
+            </w:pPr>
+            <w:r>
+              <w:rPr>
+                <w:rFonts w:ascii="Times New Roman" w:hAnsi="Times New Roman"/>
+                <w:b w:val="0"/>
+                <w:sz w:val="21"/>
+              </w:rPr>
+              <w:t>9 - 2(3)(1) - 3 = 9 - 6 - 3 = 0 ✓</w:t>
+            </w:r>
+          </w:p>
+        </w:tc>
+      </w:tr>
+      <w:tr>
+        <w:tc>
+          <w:tcPr>
+            <w:tcW w:type="dxa" w:w="3120"/>
+          </w:tcPr>
+          <w:p>
+            <w:pPr>
+              <w:spacing w:line="240" w:lineRule="auto"/>
+            </w:pPr>
+            <w:r>
+              <w:rPr>
+                <w:rFonts w:ascii="Times New Roman" w:hAnsi="Times New Roman"/>
+                <w:b w:val="0"/>
+                <w:sz w:val="21"/>
+              </w:rPr>
+              <w:t>(-1/3, 13/3)</w:t>
+            </w:r>
+          </w:p>
+        </w:tc>
+        <w:tc>
+          <w:tcPr>
+            <w:tcW w:type="dxa" w:w="3120"/>
+          </w:tcPr>
+          <w:p>
+            <w:pPr>
+              <w:spacing w:line="240" w:lineRule="auto"/>
+            </w:pPr>
+            <w:r>
+              <w:rPr>
+                <w:rFonts w:ascii="Times New Roman" w:hAnsi="Times New Roman"/>
+                <w:b w:val="0"/>
+                <w:sz w:val="21"/>
+              </w:rPr>
+              <w:t>-1/3 + 13/3 = 12/3 = 4 ✓</w:t>
+            </w:r>
+          </w:p>
+        </w:tc>
+        <w:tc>
+          <w:tcPr>
+            <w:tcW w:type="dxa" w:w="3120"/>
+          </w:tcPr>
+          <w:p>
+            <w:pPr>
+              <w:spacing w:line="240" w:lineRule="auto"/>
+            </w:pPr>
+            <w:r>
+              <w:rPr>
+                <w:rFonts w:ascii="Times New Roman" w:hAnsi="Times New Roman"/>
+                <w:b w:val="0"/>
+                <w:sz w:val="21"/>
+              </w:rPr>
+              <w:t>1/9 - 2(-1/3)(13/3) - 3 = 1/9 + 26/9 - 27/9 = 0 ✓</w:t>
+            </w:r>
+          </w:p>
+        </w:tc>
+      </w:tr>
+    </w:tbl>
+    <w:p>
+      <w:pPr>
+        <w:spacing w:after="0"/>
+      </w:pPr>
+    </w:p>
+    <w:p>
+      <w:pPr>
+        <w:spacing w:line="360" w:lineRule="auto" w:after="200"/>
+      </w:pPr>
+      <w:r>
+        <w:rPr>
+          <w:rFonts w:ascii="Times New Roman" w:hAnsi="Times New Roman"/>
+          <w:b w:val="0"/>
+          <w:i w:val="0"/>
+          <w:sz w:val="24"/>
+        </w:rPr>
+        <w:t>Both points satisfy both equations, so they are exactly the points where the line meets the curve.</w:t>
+      </w:r>
+    </w:p>
+    <w:p>
+      <w:pPr>
+        <w:pStyle w:val="Heading2"/>
+        <w:jc w:val="left"/>
+      </w:pPr>
+      <w:r>
+        <w:rPr>
+          <w:rFonts w:ascii="Times New Roman" w:hAnsi="Times New Roman"/>
+          <w:b/>
+          <w:color w:val="000000"/>
+          <w:sz w:val="24"/>
+        </w:rPr>
+        <w:t>Graphical Verification</w:t>
+      </w:r>
+    </w:p>
+    <w:p>
+      <w:pPr>
+        <w:spacing w:line="360" w:lineRule="auto" w:after="200"/>
+      </w:pPr>
+      <w:r>
+        <w:rPr>
+          <w:rFonts w:ascii="Times New Roman" w:hAnsi="Times New Roman"/>
+          <w:b w:val="0"/>
+          <w:i w:val="0"/>
+          <w:sz w:val="24"/>
+        </w:rPr>
+        <w:t>Solving equation (2) for y shows what the curve looks like:</w:t>
+      </w:r>
+    </w:p>
+    <w:p>
+      <w:pPr>
+        <w:spacing w:line="240" w:lineRule="auto" w:after="0"/>
+        <w:ind w:left="432"/>
+      </w:pPr>
+      <w:r>
+        <w:rPr>
+          <w:rFonts w:ascii="Courier New" w:hAnsi="Courier New"/>
+          <w:sz w:val="19"/>
+        </w:rPr>
+        <w:t>x² - 3 = 2xy   -&gt;   y = (x² - 3) / (2x) = x/2 - 3/(2x)</w:t>
+      </w:r>
+    </w:p>
+    <w:p>
+      <w:pPr>
+        <w:spacing w:after="0"/>
+      </w:pPr>
+    </w:p>
+    <w:p>
+      <w:pPr>
+        <w:spacing w:line="360" w:lineRule="auto" w:after="200"/>
+      </w:pPr>
+      <w:r>
+        <w:rPr>
+          <w:rFonts w:ascii="Times New Roman" w:hAnsi="Times New Roman"/>
+          <w:b w:val="0"/>
+          <w:i w:val="0"/>
+          <w:sz w:val="24"/>
+        </w:rPr>
+        <w:t xml:space="preserve">This is a </w:t>
+      </w:r>
+      <w:r>
+        <w:rPr>
+          <w:rFonts w:ascii="Times New Roman" w:hAnsi="Times New Roman"/>
+          <w:b/>
+          <w:i w:val="0"/>
+          <w:sz w:val="24"/>
+        </w:rPr>
+        <w:t>hyperbola</w:t>
+      </w:r>
+      <w:r>
+        <w:rPr>
+          <w:rFonts w:ascii="Times New Roman" w:hAnsi="Times New Roman"/>
+          <w:b w:val="0"/>
+          <w:i w:val="0"/>
+          <w:sz w:val="24"/>
+        </w:rPr>
+        <w:t>. It is undefined at x = 0, so the y-axis is a vertical asymptote, and for large |x| the term 3/(2x) shrinks to 0, so the curve approaches the slanted line y = x/2. It has two branches, one on each side of the y-axis. The line x + y = 4 slopes downward and crosses each branch once, which is why there are exactly two intersection points, one on each branch.</w:t>
+      </w:r>
+    </w:p>
+    <w:p>
+      <w:pPr>
+        <w:spacing w:line="360" w:lineRule="auto" w:after="200"/>
+      </w:pPr>
+      <w:r>
+        <w:rPr>
+          <w:rFonts w:ascii="Times New Roman" w:hAnsi="Times New Roman"/>
+          <w:b w:val="0"/>
+          <w:i w:val="0"/>
+          <w:sz w:val="24"/>
+        </w:rPr>
+        <w:t>Figure 1 shows both graphs drawn in GeoGebra, with the intersection points found by GeoGebra's Intersect command: A = (3, 1) on the right branch and B ≈ (-0.33, 4.33) on the left branch. The graph agrees with the algebraic solution.</w:t>
+      </w:r>
+    </w:p>
+    <w:p>
+      <w:pPr>
+        <w:spacing w:line="360" w:lineRule="auto" w:after="0"/>
+      </w:pPr>
+      <w:r>
+        <w:rPr>
+          <w:rFonts w:ascii="Times New Roman" w:hAnsi="Times New Roman"/>
+          <w:b/>
+          <w:i w:val="0"/>
+          <w:sz w:val="24"/>
+        </w:rPr>
+        <w:t>Figure 1</w:t>
+      </w:r>
+    </w:p>
+    <w:p>
+      <w:pPr>
+        <w:spacing w:line="360" w:lineRule="auto" w:after="0"/>
+      </w:pPr>
+      <w:r>
+        <w:rPr>
+          <w:rFonts w:ascii="Times New Roman" w:hAnsi="Times New Roman"/>
+          <w:b w:val="0"/>
+          <w:i/>
+          <w:sz w:val="24"/>
+        </w:rPr>
+        <w:t>The Line x + y = 4 and the Hyperbola x² - 2xy - 3 = 0, Meeting at A(3, 1) and B(-1/3, 13/3)</w:t>
+      </w:r>
+    </w:p>
+    <w:p>
+      <w:pPr>
+        <w:spacing w:after="200"/>
+        <w:jc w:val="center"/>
+      </w:pPr>
+      <w:r>
+        <w:rPr>
+          <w:rFonts w:ascii="Times New Roman" w:hAnsi="Times New Roman"/>
+          <w:b/>
+          <w:i w:val="0"/>
+          <w:sz w:val="24"/>
+        </w:rPr>
+        <w:t>[ Insert GeoGebra graph: figures/fig1_task3.png ]</w:t>
+      </w:r>
+    </w:p>
+    <w:p>
+      <w:pPr>
+        <w:pStyle w:val="Heading1"/>
+        <w:jc w:val="left"/>
+      </w:pPr>
+      <w:r>
+        <w:rPr>
+          <w:rFonts w:ascii="Times New Roman" w:hAnsi="Times New Roman"/>
+          <w:b/>
+          <w:color w:val="000000"/>
+          <w:sz w:val="24"/>
+        </w:rPr>
+        <w:t>Summary of Answers</w:t>
+      </w:r>
+    </w:p>
+    <w:p>
+      <w:pPr>
+        <w:spacing w:line="360" w:lineRule="auto" w:after="0"/>
+      </w:pPr>
+      <w:r>
+        <w:rPr>
+          <w:rFonts w:ascii="Times New Roman" w:hAnsi="Times New Roman"/>
+          <w:b/>
+          <w:i w:val="0"/>
+          <w:sz w:val="24"/>
+        </w:rPr>
+        <w:t>Table 3</w:t>
+      </w:r>
+    </w:p>
+    <w:p>
+      <w:pPr>
+        <w:spacing w:line="360" w:lineRule="auto" w:after="0"/>
+      </w:pPr>
+      <w:r>
+        <w:rPr>
+          <w:rFonts w:ascii="Times New Roman" w:hAnsi="Times New Roman"/>
+          <w:b w:val="0"/>
+          <w:i/>
+          <w:sz w:val="24"/>
+        </w:rPr>
+        <w:t>Final Answers</w:t>
+      </w:r>
+    </w:p>
+    <w:tbl>
+      <w:tblPr>
+        <w:tblStyle w:val="TableGrid"/>
+        <w:tblW w:type="auto" w:w="0"/>
+        <w:tblLook w:firstColumn="1" w:firstRow="1" w:lastColumn="0" w:lastRow="0" w:noHBand="0" w:noVBand="1" w:val="04A0"/>
+      </w:tblPr>
+      <w:tblGrid>
+        <w:gridCol w:w="4680"/>
+        <w:gridCol w:w="4680"/>
+      </w:tblGrid>
+      <w:tr>
+        <w:tc>
+          <w:tcPr>
+            <w:tcW w:type="dxa" w:w="4680"/>
+          </w:tcPr>
+          <w:p>
+            <w:pPr>
+              <w:spacing w:line="240" w:lineRule="auto"/>
+            </w:pPr>
+            <w:r>
+              <w:rPr>
+                <w:rFonts w:ascii="Times New Roman" w:hAnsi="Times New Roman"/>
+                <w:b/>
+                <w:sz w:val="21"/>
+              </w:rPr>
+              <w:t>Task</w:t>
+            </w:r>
+          </w:p>
+        </w:tc>
+        <w:tc>
+          <w:tcPr>
+            <w:tcW w:type="dxa" w:w="4680"/>
+          </w:tcPr>
+          <w:p>
+            <w:pPr>
+              <w:spacing w:line="240" w:lineRule="auto"/>
+            </w:pPr>
+            <w:r>
+              <w:rPr>
+                <w:rFonts w:ascii="Times New Roman" w:hAnsi="Times New Roman"/>
+                <w:b/>
+                <w:sz w:val="21"/>
+              </w:rPr>
+              <w:t>Answer</w:t>
+            </w:r>
+          </w:p>
+        </w:tc>
+      </w:tr>
+      <w:tr>
+        <w:tc>
+          <w:tcPr>
+            <w:tcW w:type="dxa" w:w="4680"/>
+          </w:tcPr>
+          <w:p>
+            <w:pPr>
+              <w:spacing w:line="240" w:lineRule="auto"/>
+            </w:pPr>
+            <w:r>
+              <w:rPr>
+                <w:rFonts w:ascii="Times New Roman" w:hAnsi="Times New Roman"/>
+                <w:b w:val="0"/>
+                <w:sz w:val="21"/>
+              </w:rPr>
+              <w:t>1 (i)</w:t>
+            </w:r>
+          </w:p>
+        </w:tc>
+        <w:tc>
+          <w:tcPr>
+            <w:tcW w:type="dxa" w:w="4680"/>
+          </w:tcPr>
+          <w:p>
+            <w:pPr>
+              <w:spacing w:line="240" w:lineRule="auto"/>
+            </w:pPr>
+            <w:r>
+              <w:rPr>
+                <w:rFonts w:ascii="Times New Roman" w:hAnsi="Times New Roman"/>
+                <w:b w:val="0"/>
+                <w:sz w:val="21"/>
+              </w:rPr>
+              <w:t>a + b + c = 25; c = 3(a + b) + 20; 5(a + b + c) = 125</w:t>
+            </w:r>
+          </w:p>
+        </w:tc>
+      </w:tr>
+      <w:tr>
+        <w:tc>
+          <w:tcPr>
+            <w:tcW w:type="dxa" w:w="4680"/>
+          </w:tcPr>
+          <w:p>
+            <w:pPr>
+              <w:spacing w:line="240" w:lineRule="auto"/>
+            </w:pPr>
+            <w:r>
+              <w:rPr>
+                <w:rFonts w:ascii="Times New Roman" w:hAnsi="Times New Roman"/>
+                <w:b w:val="0"/>
+                <w:sz w:val="21"/>
+              </w:rPr>
+              <w:t>1 (ii)</w:t>
+            </w:r>
+          </w:p>
+        </w:tc>
+        <w:tc>
+          <w:tcPr>
+            <w:tcW w:type="dxa" w:w="4680"/>
+          </w:tcPr>
+          <w:p>
+            <w:pPr>
+              <w:spacing w:line="240" w:lineRule="auto"/>
+            </w:pPr>
+            <w:r>
+              <w:rPr>
+                <w:rFonts w:ascii="Times New Roman" w:hAnsi="Times New Roman"/>
+                <w:b w:val="0"/>
+                <w:sz w:val="21"/>
+              </w:rPr>
+              <w:t>Consistent, dependent (not independent), infinitely many solutions</w:t>
+            </w:r>
+          </w:p>
+        </w:tc>
+      </w:tr>
+      <w:tr>
+        <w:tc>
+          <w:tcPr>
+            <w:tcW w:type="dxa" w:w="4680"/>
+          </w:tcPr>
+          <w:p>
+            <w:pPr>
+              <w:spacing w:line="240" w:lineRule="auto"/>
+            </w:pPr>
+            <w:r>
+              <w:rPr>
+                <w:rFonts w:ascii="Times New Roman" w:hAnsi="Times New Roman"/>
+                <w:b w:val="0"/>
+                <w:sz w:val="21"/>
+              </w:rPr>
+              <w:t>1 (iii)</w:t>
+            </w:r>
+          </w:p>
+        </w:tc>
+        <w:tc>
+          <w:tcPr>
+            <w:tcW w:type="dxa" w:w="4680"/>
+          </w:tcPr>
+          <w:p>
+            <w:pPr>
+              <w:spacing w:line="240" w:lineRule="auto"/>
+            </w:pPr>
+            <w:r>
+              <w:rPr>
+                <w:rFonts w:ascii="Times New Roman" w:hAnsi="Times New Roman"/>
+                <w:b w:val="0"/>
+                <w:sz w:val="21"/>
+              </w:rPr>
+              <w:t>Special toy $23.75; the other two together $1.25 (individual prices not determined)</w:t>
+            </w:r>
+          </w:p>
+        </w:tc>
+      </w:tr>
+      <w:tr>
+        <w:tc>
+          <w:tcPr>
+            <w:tcW w:type="dxa" w:w="4680"/>
+          </w:tcPr>
+          <w:p>
+            <w:pPr>
+              <w:spacing w:line="240" w:lineRule="auto"/>
+            </w:pPr>
+            <w:r>
+              <w:rPr>
+                <w:rFonts w:ascii="Times New Roman" w:hAnsi="Times New Roman"/>
+                <w:b w:val="0"/>
+                <w:sz w:val="21"/>
+              </w:rPr>
+              <w:t>2</w:t>
+            </w:r>
+          </w:p>
+        </w:tc>
+        <w:tc>
+          <w:tcPr>
+            <w:tcW w:type="dxa" w:w="4680"/>
+          </w:tcPr>
+          <w:p>
+            <w:pPr>
+              <w:spacing w:line="240" w:lineRule="auto"/>
+            </w:pPr>
+            <w:r>
+              <w:rPr>
+                <w:rFonts w:ascii="Times New Roman" w:hAnsi="Times New Roman"/>
+                <w:b w:val="0"/>
+                <w:sz w:val="21"/>
+              </w:rPr>
+              <w:t>x = 1/2, y = -7/2, z = 0</w:t>
+            </w:r>
+          </w:p>
+        </w:tc>
+      </w:tr>
+      <w:tr>
+        <w:tc>
+          <w:tcPr>
+            <w:tcW w:type="dxa" w:w="4680"/>
+          </w:tcPr>
+          <w:p>
+            <w:pPr>
+              <w:spacing w:line="240" w:lineRule="auto"/>
+            </w:pPr>
+            <w:r>
+              <w:rPr>
+                <w:rFonts w:ascii="Times New Roman" w:hAnsi="Times New Roman"/>
+                <w:b w:val="0"/>
+                <w:sz w:val="21"/>
+              </w:rPr>
+              <w:t>3</w:t>
+            </w:r>
+          </w:p>
+        </w:tc>
+        <w:tc>
+          <w:tcPr>
+            <w:tcW w:type="dxa" w:w="4680"/>
+          </w:tcPr>
+          <w:p>
+            <w:pPr>
+              <w:spacing w:line="240" w:lineRule="auto"/>
+            </w:pPr>
+            <w:r>
+              <w:rPr>
+                <w:rFonts w:ascii="Times New Roman" w:hAnsi="Times New Roman"/>
+                <w:b w:val="0"/>
+                <w:sz w:val="21"/>
+              </w:rPr>
+              <w:t>(3, 1) and (-1/3, 13/3), confirmed algebraically and on the GeoGebra graph</w:t>
+            </w:r>
+          </w:p>
+        </w:tc>
+      </w:tr>
+    </w:tbl>
+    <w:p>
+      <w:pPr>
+        <w:spacing w:after="0"/>
+      </w:pPr>
     </w:p>
     <w:p>
       <w:r>
@@ -1947,6 +2915,50 @@
             <w:sz w:val="24"/>
           </w:rPr>
           <w:t>https://www.youtube.com/watch?v=-aAucWVD--M</w:t>
+        </w:r>
+      </w:hyperlink>
+    </w:p>
+    <w:p>
+      <w:pPr>
+        <w:spacing w:line="360" w:lineRule="auto" w:after="0"/>
+        <w:ind w:left="720" w:hanging="720"/>
+      </w:pPr>
+      <w:r>
+        <w:rPr>
+          <w:rFonts w:ascii="Times New Roman" w:hAnsi="Times New Roman"/>
+          <w:b w:val="0"/>
+          <w:i w:val="0"/>
+          <w:sz w:val="24"/>
+        </w:rPr>
+        <w:t xml:space="preserve">Mathispower4u. (2012, September 10). </w:t>
+      </w:r>
+      <w:r>
+        <w:rPr>
+          <w:rFonts w:ascii="Times New Roman" w:hAnsi="Times New Roman"/>
+          <w:b w:val="0"/>
+          <w:i/>
+          <w:sz w:val="24"/>
+        </w:rPr>
+        <w:t>Ex 1: Solve a system of nonlinear equations (substitution)</w:t>
+      </w:r>
+      <w:r>
+        <w:rPr>
+          <w:rFonts w:ascii="Times New Roman" w:hAnsi="Times New Roman"/>
+          <w:b w:val="0"/>
+          <w:i w:val="0"/>
+          <w:sz w:val="24"/>
+        </w:rPr>
+        <w:t xml:space="preserve"> [Video]. YouTube. </w:t>
+      </w:r>
+      <w:hyperlink r:id="rId12">
+        <w:r>
+          <w:rPr>
+            <w:rFonts w:ascii="Times New Roman" w:hAnsi="Times New Roman"/>
+            <w:color w:val="0563C1"/>
+            <w:u w:val="single"/>
+            <w:sz w:val="24"/>
+          </w:rPr>
+          <w:t>https://www.youtube.com/watch?v=VI4V_X_ZZLc</w:t>
         </w:r>
       </w:hyperlink>
     </w:p>

</xml_diff>

<commit_message>
MATH1201 Unit 8: add Task 3 GeoGebra graph (line and hyperbola intersections)
Co-Authored-By: Claude Opus 5.5 <noreply@anthropic.com>
</commit_message>
<xml_diff>
--- a/MATH1201_College_Algebra/Unit8_Systems_of_Equations/Assignment/Unit8_Assignment_Activity.docx
+++ b/MATH1201_College_Algebra/Unit8_Systems_of_Equations/Assignment/Unit8_Assignment_Activity.docx
@@ -2514,13 +2514,38 @@
         <w:jc w:val="center"/>
       </w:pPr>
       <w:r>
-        <w:rPr>
-          <w:rFonts w:ascii="Times New Roman" w:hAnsi="Times New Roman"/>
-          <w:b/>
-          <w:i w:val="0"/>
-          <w:sz w:val="24"/>
-        </w:rPr>
-        <w:t>[ Insert GeoGebra graph: figures/fig1_task3.png ]</w:t>
+        <w:drawing>
+          <wp:inline xmlns:a="http://schemas.openxmlformats.org/drawingml/2006/main" xmlns:pic="http://schemas.openxmlformats.org/drawingml/2006/picture">
+            <wp:extent cx="5486400" cy="3653941"/>
+            <wp:docPr id="1" name="Picture 1"/>
+            <wp:cNvGraphicFramePr>
+              <a:graphicFrameLocks noChangeAspect="1"/>
+            </wp:cNvGraphicFramePr>
+            <a:graphic>
+              <a:graphicData uri="http://schemas.openxmlformats.org/drawingml/2006/picture">
+                <pic:pic>
+                  <pic:nvPicPr>
+                    <pic:cNvPr id="0" name="fig1_task3.png"/>
+                    <pic:cNvPicPr/>
+                  </pic:nvPicPr>
+                  <pic:blipFill>
+                    <a:blip r:embed="rId10"/>
+                    <a:stretch>
+                      <a:fillRect/>
+                    </a:stretch>
+                  </pic:blipFill>
+                  <pic:spPr>
+                    <a:xfrm>
+                      <a:off x="0" y="0"/>
+                      <a:ext cx="5486400" cy="3653941"/>
+                    </a:xfrm>
+                    <a:prstGeom prst="rect"/>
+                  </pic:spPr>
+                </pic:pic>
+              </a:graphicData>
+            </a:graphic>
+          </wp:inline>
+        </w:drawing>
       </w:r>
     </w:p>
     <w:p>
@@ -2862,7 +2887,7 @@
         </w:rPr>
         <w:t xml:space="preserve"> (2nd ed.). OpenStax. </w:t>
       </w:r>
-      <w:hyperlink r:id="rId10">
+      <w:hyperlink r:id="rId11">
         <w:r>
           <w:rPr>
             <w:rFonts w:ascii="Times New Roman" w:hAnsi="Times New Roman"/>
@@ -2906,7 +2931,7 @@
         </w:rPr>
         <w:t xml:space="preserve"> [Video]. YouTube. </w:t>
       </w:r>
-      <w:hyperlink r:id="rId11">
+      <w:hyperlink r:id="rId12">
         <w:r>
           <w:rPr>
             <w:rFonts w:ascii="Times New Roman" w:hAnsi="Times New Roman"/>
@@ -2950,7 +2975,7 @@
         </w:rPr>
         <w:t xml:space="preserve"> [Video]. YouTube. </w:t>
       </w:r>
-      <w:hyperlink r:id="rId12">
+      <w:hyperlink r:id="rId13">
         <w:r>
           <w:rPr>
             <w:rFonts w:ascii="Times New Roman" w:hAnsi="Times New Roman"/>

</xml_diff>

<commit_message>
MATH1201 Unit 8: explicit consistent example, state why Task 1 is not independent, font-safe checks
Co-Authored-By: Claude Opus 5.5 <noreply@anthropic.com>
</commit_message>
<xml_diff>
--- a/MATH1201_College_Algebra/Unit8_Systems_of_Equations/Assignment/Unit8_Assignment_Activity.docx
+++ b/MATH1201_College_Algebra/Unit8_Systems_of_Equations/Assignment/Unit8_Assignment_Activity.docx
@@ -818,6 +818,56 @@
     </w:p>
     <w:p>
       <w:pPr>
+        <w:spacing w:line="360" w:lineRule="auto" w:after="200"/>
+      </w:pPr>
+      <w:r>
+        <w:rPr>
+          <w:rFonts w:ascii="Times New Roman" w:hAnsi="Times New Roman"/>
+          <w:b w:val="0"/>
+          <w:i w:val="0"/>
+          <w:sz w:val="24"/>
+        </w:rPr>
+        <w:t xml:space="preserve">In short, the task asks whether the system is consistent and independent: it </w:t>
+      </w:r>
+      <w:r>
+        <w:rPr>
+          <w:rFonts w:ascii="Times New Roman" w:hAnsi="Times New Roman"/>
+          <w:b/>
+          <w:i w:val="0"/>
+          <w:sz w:val="24"/>
+        </w:rPr>
+        <w:t>is consistent</w:t>
+      </w:r>
+      <w:r>
+        <w:rPr>
+          <w:rFonts w:ascii="Times New Roman" w:hAnsi="Times New Roman"/>
+          <w:b w:val="0"/>
+          <w:i w:val="0"/>
+          <w:sz w:val="24"/>
+        </w:rPr>
+        <w:t xml:space="preserve"> but </w:t>
+      </w:r>
+      <w:r>
+        <w:rPr>
+          <w:rFonts w:ascii="Times New Roman" w:hAnsi="Times New Roman"/>
+          <w:b/>
+          <w:i w:val="0"/>
+          <w:sz w:val="24"/>
+        </w:rPr>
+        <w:t>is not independent</w:t>
+      </w:r>
+      <w:r>
+        <w:rPr>
+          <w:rFonts w:ascii="Times New Roman" w:hAnsi="Times New Roman"/>
+          <w:b w:val="0"/>
+          <w:i w:val="0"/>
+          <w:sz w:val="24"/>
+        </w:rPr>
+        <w:t>. An independent system with three unknowns needs three equations that each add new information, and here the third statement only repeats the first. That is why one toy's price can be found exactly while the other two can only be found as a total.</w:t>
+      </w:r>
+    </w:p>
+    <w:p>
+      <w:pPr>
         <w:pStyle w:val="Heading2"/>
         <w:jc w:val="left"/>
       </w:pPr>
@@ -1765,7 +1815,7 @@
           <w:rFonts w:ascii="Courier New" w:hAnsi="Courier New"/>
           <w:sz w:val="19"/>
         </w:rPr>
-        <w:t xml:space="preserve"> x - y +  z = 0.5 + 3.5 + 0        = 4   ✓</w:t>
+        <w:t xml:space="preserve"> x - y +  z = 0.5 + 3.5 + 0        = 4   correct</w:t>
       </w:r>
     </w:p>
     <w:p>
@@ -1778,7 +1828,7 @@
           <w:rFonts w:ascii="Courier New" w:hAnsi="Courier New"/>
           <w:sz w:val="19"/>
         </w:rPr>
-        <w:t>5x - y +  z = 2.5 + 3.5 + 0        = 6   ✓</w:t>
+        <w:t>5x - y +  z = 2.5 + 3.5 + 0        = 6   correct</w:t>
       </w:r>
     </w:p>
     <w:p>
@@ -1791,7 +1841,7 @@
           <w:rFonts w:ascii="Courier New" w:hAnsi="Courier New"/>
           <w:sz w:val="19"/>
         </w:rPr>
-        <w:t>3x - y + 5z = 1.5 + 3.5 + 0        = 5   ✓</w:t>
+        <w:t>3x - y + 5z = 1.5 + 3.5 + 0        = 5   correct</w:t>
       </w:r>
     </w:p>
     <w:p>
@@ -2288,7 +2338,7 @@
                 <w:b w:val="0"/>
                 <w:sz w:val="21"/>
               </w:rPr>
-              <w:t>3 + 1 = 4 ✓</w:t>
+              <w:t>3 + 1 = 4 (correct)</w:t>
             </w:r>
           </w:p>
         </w:tc>
@@ -2306,7 +2356,7 @@
                 <w:b w:val="0"/>
                 <w:sz w:val="21"/>
               </w:rPr>
-              <w:t>9 - 2(3)(1) - 3 = 9 - 6 - 3 = 0 ✓</w:t>
+              <w:t>9 - 2(3)(1) - 3 = 9 - 6 - 3 = 0 (correct)</w:t>
             </w:r>
           </w:p>
         </w:tc>
@@ -2344,7 +2394,7 @@
                 <w:b w:val="0"/>
                 <w:sz w:val="21"/>
               </w:rPr>
-              <w:t>-1/3 + 13/3 = 12/3 = 4 ✓</w:t>
+              <w:t>-1/3 + 13/3 = 12/3 = 4 (correct)</w:t>
             </w:r>
           </w:p>
         </w:tc>
@@ -2362,7 +2412,7 @@
                 <w:b w:val="0"/>
                 <w:sz w:val="21"/>
               </w:rPr>
-              <w:t>1/9 - 2(-1/3)(13/3) - 3 = 1/9 + 26/9 - 27/9 = 0 ✓</w:t>
+              <w:t>1/9 - 2(-1/3)(13/3) - 3 = 1/9 + 26/9 - 27/9 = 0 (correct)</w:t>
             </w:r>
           </w:p>
         </w:tc>

</xml_diff>